<commit_message>
Update Diseño de contenido
</commit_message>
<xml_diff>
--- a/Fase 2/Diseño del contenido.docx
+++ b/Fase 2/Diseño del contenido.docx
@@ -52,8 +52,8 @@
         <w:tblLook w:val="04A0" w:firstRow="1" w:lastRow="0" w:firstColumn="1" w:lastColumn="0" w:noHBand="0" w:noVBand="1"/>
       </w:tblPr>
       <w:tblGrid>
-        <w:gridCol w:w="1701"/>
-        <w:gridCol w:w="6793"/>
+        <w:gridCol w:w="1732"/>
+        <w:gridCol w:w="6762"/>
       </w:tblGrid>
       <w:tr>
         <w:tc>
@@ -106,7 +106,17 @@
             <w:hideMark/>
           </w:tcPr>
           <w:p>
-            <w:r>
+            <w:pPr>
+              <w:rPr>
+                <w:b/>
+                <w:bCs/>
+              </w:rPr>
+            </w:pPr>
+            <w:r>
+              <w:rPr>
+                <w:b/>
+                <w:bCs/>
+              </w:rPr>
               <w:t>Presentación</w:t>
             </w:r>
           </w:p>
@@ -136,7 +146,17 @@
             <w:hideMark/>
           </w:tcPr>
           <w:p>
-            <w:r>
+            <w:pPr>
+              <w:rPr>
+                <w:b/>
+                <w:bCs/>
+              </w:rPr>
+            </w:pPr>
+            <w:r>
+              <w:rPr>
+                <w:b/>
+                <w:bCs/>
+              </w:rPr>
               <w:t>Sobre mí</w:t>
             </w:r>
           </w:p>
@@ -165,7 +185,17 @@
             <w:hideMark/>
           </w:tcPr>
           <w:p>
-            <w:r>
+            <w:pPr>
+              <w:rPr>
+                <w:b/>
+                <w:bCs/>
+              </w:rPr>
+            </w:pPr>
+            <w:r>
+              <w:rPr>
+                <w:b/>
+                <w:bCs/>
+              </w:rPr>
               <w:t>Áreas de interés</w:t>
             </w:r>
           </w:p>
@@ -176,99 +206,66 @@
             <w:hideMark/>
           </w:tcPr>
           <w:p>
-            <w:r>
-              <w:t>Mostrar las áreas en las que dese</w:t>
-            </w:r>
-            <w:r>
-              <w:t xml:space="preserve">o </w:t>
-            </w:r>
-            <w:r>
-              <w:t>desarrollar</w:t>
-            </w:r>
-            <w:r>
-              <w:t>me.</w:t>
-            </w:r>
-          </w:p>
-        </w:tc>
-      </w:tr>
-      <w:tr>
-        <w:tc>
-          <w:tcPr>
-            <w:tcW w:w="0" w:type="auto"/>
-            <w:hideMark/>
-          </w:tcPr>
-          <w:p>
-            <w:r>
-              <w:t>Habilidades y tecnologías</w:t>
-            </w:r>
-          </w:p>
-        </w:tc>
-        <w:tc>
-          <w:tcPr>
-            <w:tcW w:w="0" w:type="auto"/>
-            <w:hideMark/>
-          </w:tcPr>
-          <w:p>
-            <w:r>
-              <w:t>Actualmente tengo conocimientos en los siguientes lenguajes</w:t>
-            </w:r>
-            <w:r>
-              <w:t>:</w:t>
-            </w:r>
-          </w:p>
-          <w:p>
             <w:pPr>
+              <w:pStyle w:val="Prrafodelista"/>
               <w:numPr>
                 <w:ilvl w:val="0"/>
-                <w:numId w:val="9"/>
+                <w:numId w:val="14"/>
               </w:numPr>
             </w:pPr>
             <w:r>
-              <w:t>Python</w:t>
+              <w:t>Inteligencia artificial.</w:t>
             </w:r>
           </w:p>
           <w:p>
             <w:pPr>
+              <w:pStyle w:val="Prrafodelista"/>
               <w:numPr>
                 <w:ilvl w:val="0"/>
-                <w:numId w:val="9"/>
+                <w:numId w:val="14"/>
               </w:numPr>
             </w:pPr>
             <w:r>
-              <w:t>Java</w:t>
+              <w:t>Desarrollo web.</w:t>
             </w:r>
           </w:p>
           <w:p>
             <w:pPr>
+              <w:pStyle w:val="Prrafodelista"/>
               <w:numPr>
                 <w:ilvl w:val="0"/>
-                <w:numId w:val="9"/>
+                <w:numId w:val="14"/>
               </w:numPr>
             </w:pPr>
             <w:r>
-              <w:t>C++</w:t>
+              <w:t>Ciberseguridad.</w:t>
             </w:r>
           </w:p>
           <w:p>
             <w:pPr>
+              <w:pStyle w:val="Prrafodelista"/>
               <w:numPr>
                 <w:ilvl w:val="0"/>
-                <w:numId w:val="9"/>
+                <w:numId w:val="14"/>
               </w:numPr>
             </w:pPr>
             <w:r>
-              <w:t>SQL</w:t>
+              <w:t>Automatización de procesos.</w:t>
             </w:r>
           </w:p>
           <w:p>
             <w:pPr>
+              <w:pStyle w:val="Prrafodelista"/>
               <w:numPr>
                 <w:ilvl w:val="0"/>
-                <w:numId w:val="9"/>
+                <w:numId w:val="14"/>
               </w:numPr>
             </w:pPr>
             <w:r>
-              <w:t>HTML</w:t>
+              <w:t>Bases</w:t>
+            </w:r>
+            <w:r>
+              <w:t xml:space="preserve"> de datos.</w:t>
             </w:r>
           </w:p>
           <w:p/>
@@ -281,7 +278,115 @@
             <w:hideMark/>
           </w:tcPr>
           <w:p>
-            <w:r>
+            <w:pPr>
+              <w:rPr>
+                <w:b/>
+                <w:bCs/>
+              </w:rPr>
+            </w:pPr>
+            <w:r>
+              <w:rPr>
+                <w:b/>
+                <w:bCs/>
+              </w:rPr>
+              <w:t>Habilidades y tecnologías</w:t>
+            </w:r>
+          </w:p>
+        </w:tc>
+        <w:tc>
+          <w:tcPr>
+            <w:tcW w:w="0" w:type="auto"/>
+            <w:hideMark/>
+          </w:tcPr>
+          <w:p>
+            <w:r>
+              <w:t>Actualmente tengo conocimientos en los siguientes lenguajes</w:t>
+            </w:r>
+            <w:r>
+              <w:t>:</w:t>
+            </w:r>
+          </w:p>
+          <w:p>
+            <w:pPr>
+              <w:pStyle w:val="Prrafodelista"/>
+              <w:numPr>
+                <w:ilvl w:val="0"/>
+                <w:numId w:val="16"/>
+              </w:numPr>
+            </w:pPr>
+            <w:r>
+              <w:t>Python</w:t>
+            </w:r>
+          </w:p>
+          <w:p>
+            <w:pPr>
+              <w:pStyle w:val="Prrafodelista"/>
+              <w:numPr>
+                <w:ilvl w:val="0"/>
+                <w:numId w:val="16"/>
+              </w:numPr>
+            </w:pPr>
+            <w:r>
+              <w:t>Java</w:t>
+            </w:r>
+          </w:p>
+          <w:p>
+            <w:pPr>
+              <w:pStyle w:val="Prrafodelista"/>
+              <w:numPr>
+                <w:ilvl w:val="0"/>
+                <w:numId w:val="16"/>
+              </w:numPr>
+            </w:pPr>
+            <w:r>
+              <w:t>C++</w:t>
+            </w:r>
+          </w:p>
+          <w:p>
+            <w:pPr>
+              <w:pStyle w:val="Prrafodelista"/>
+              <w:numPr>
+                <w:ilvl w:val="0"/>
+                <w:numId w:val="16"/>
+              </w:numPr>
+            </w:pPr>
+            <w:r>
+              <w:t>SQL</w:t>
+            </w:r>
+          </w:p>
+          <w:p>
+            <w:pPr>
+              <w:pStyle w:val="Prrafodelista"/>
+              <w:numPr>
+                <w:ilvl w:val="0"/>
+                <w:numId w:val="16"/>
+              </w:numPr>
+            </w:pPr>
+            <w:r>
+              <w:t>HTML</w:t>
+            </w:r>
+          </w:p>
+          <w:p/>
+        </w:tc>
+      </w:tr>
+      <w:tr>
+        <w:tc>
+          <w:tcPr>
+            <w:tcW w:w="0" w:type="auto"/>
+            <w:hideMark/>
+          </w:tcPr>
+          <w:p>
+            <w:pPr>
+              <w:rPr>
+                <w:b/>
+                <w:bCs/>
+              </w:rPr>
+            </w:pPr>
+            <w:r>
+              <w:rPr>
+                <w:b/>
+                <w:bCs/>
+              </w:rPr>
               <w:t>Proyectos destacados</w:t>
             </w:r>
           </w:p>
@@ -347,44 +452,6 @@
               <w:t>Simulador de la fase de grupos del Mundial 2026: gestión de equipos, simulación de partidos con goles aleatorios, tabla de posiciones y clasificación.</w:t>
             </w:r>
           </w:p>
-          <w:p>
-            <w:pPr>
-              <w:pStyle w:val="Prrafodelista"/>
-              <w:numPr>
-                <w:ilvl w:val="0"/>
-                <w:numId w:val="10"/>
-              </w:numPr>
-            </w:pPr>
-            <w:r>
-              <w:rPr>
-                <w:b/>
-                <w:bCs/>
-              </w:rPr>
-              <w:t>Aspectos</w:t>
-            </w:r>
-            <w:r>
-              <w:t xml:space="preserve">: </w:t>
-            </w:r>
-            <w:r>
-              <w:t xml:space="preserve">Demostración de AOP con Java y </w:t>
-            </w:r>
-            <w:proofErr w:type="spellStart"/>
-            <w:r>
-              <w:t>AspectJ</w:t>
-            </w:r>
-            <w:proofErr w:type="spellEnd"/>
-            <w:r>
-              <w:t xml:space="preserve">: cambio de color de ventana, registro de eventos, patrón </w:t>
-            </w:r>
-            <w:proofErr w:type="spellStart"/>
-            <w:r>
-              <w:t>Observer</w:t>
-            </w:r>
-            <w:proofErr w:type="spellEnd"/>
-            <w:r>
-              <w:t xml:space="preserve"> y contador en tiempo real.</w:t>
-            </w:r>
-          </w:p>
         </w:tc>
       </w:tr>
       <w:tr>
@@ -394,7 +461,17 @@
             <w:hideMark/>
           </w:tcPr>
           <w:p>
-            <w:r>
+            <w:pPr>
+              <w:rPr>
+                <w:b/>
+                <w:bCs/>
+              </w:rPr>
+            </w:pPr>
+            <w:r>
+              <w:rPr>
+                <w:b/>
+                <w:bCs/>
+              </w:rPr>
               <w:t>Contacto</w:t>
             </w:r>
           </w:p>
@@ -432,19 +509,7 @@
                 <w:rPr>
                   <w:rStyle w:val="Hipervnculo"/>
                 </w:rPr>
-                <w:t>JacquelineCu</w:t>
-              </w:r>
-              <w:r>
-                <w:rPr>
-                  <w:rStyle w:val="Hipervnculo"/>
-                </w:rPr>
-                <w:t>e</w:t>
-              </w:r>
-              <w:r>
-                <w:rPr>
-                  <w:rStyle w:val="Hipervnculo"/>
-                </w:rPr>
-                <w:t>nca</w:t>
+                <w:t>JacquelineCuenca</w:t>
               </w:r>
               <w:proofErr w:type="spellEnd"/>
             </w:hyperlink>
@@ -499,6 +564,699 @@
             </w:r>
           </w:p>
           <w:p/>
+        </w:tc>
+      </w:tr>
+    </w:tbl>
+    <w:p>
+      <w:pPr>
+        <w:rPr>
+          <w:lang w:val="es-MX"/>
+        </w:rPr>
+      </w:pPr>
+    </w:p>
+    <w:p>
+      <w:pPr>
+        <w:rPr>
+          <w:b/>
+          <w:bCs/>
+        </w:rPr>
+      </w:pPr>
+      <w:r>
+        <w:rPr>
+          <w:b/>
+          <w:bCs/>
+        </w:rPr>
+        <w:t>F</w:t>
+      </w:r>
+      <w:r>
+        <w:rPr>
+          <w:b/>
+          <w:bCs/>
+        </w:rPr>
+        <w:t xml:space="preserve">icha para cada proyecto que </w:t>
+      </w:r>
+      <w:r>
+        <w:rPr>
+          <w:b/>
+          <w:bCs/>
+        </w:rPr>
+        <w:t>voy a</w:t>
+      </w:r>
+      <w:r>
+        <w:rPr>
+          <w:b/>
+          <w:bCs/>
+        </w:rPr>
+        <w:t xml:space="preserve"> destacar</w:t>
+      </w:r>
+      <w:r>
+        <w:rPr>
+          <w:b/>
+          <w:bCs/>
+        </w:rPr>
+        <w:t>:</w:t>
+      </w:r>
+    </w:p>
+    <w:p>
+      <w:pPr>
+        <w:pStyle w:val="Prrafodelista"/>
+        <w:numPr>
+          <w:ilvl w:val="0"/>
+          <w:numId w:val="17"/>
+        </w:numPr>
+        <w:rPr>
+          <w:b/>
+          <w:bCs/>
+        </w:rPr>
+      </w:pPr>
+      <w:r>
+        <w:rPr>
+          <w:b/>
+          <w:bCs/>
+        </w:rPr>
+        <w:t>Explorando-la-cultura-con-la-web</w:t>
+      </w:r>
+    </w:p>
+    <w:tbl>
+      <w:tblPr>
+        <w:tblStyle w:val="Tablaconcuadrcula"/>
+        <w:tblW w:w="0" w:type="auto"/>
+        <w:tblLook w:val="04A0" w:firstRow="1" w:lastRow="0" w:firstColumn="1" w:lastColumn="0" w:noHBand="0" w:noVBand="1"/>
+      </w:tblPr>
+      <w:tblGrid>
+        <w:gridCol w:w="1886"/>
+        <w:gridCol w:w="6608"/>
+      </w:tblGrid>
+      <w:tr>
+        <w:tc>
+          <w:tcPr>
+            <w:tcW w:w="0" w:type="auto"/>
+            <w:hideMark/>
+          </w:tcPr>
+          <w:p>
+            <w:pPr>
+              <w:rPr>
+                <w:b/>
+                <w:bCs/>
+              </w:rPr>
+            </w:pPr>
+            <w:r>
+              <w:rPr>
+                <w:b/>
+                <w:bCs/>
+              </w:rPr>
+              <w:t>Característica</w:t>
+            </w:r>
+          </w:p>
+        </w:tc>
+        <w:tc>
+          <w:tcPr>
+            <w:tcW w:w="0" w:type="auto"/>
+            <w:hideMark/>
+          </w:tcPr>
+          <w:p>
+            <w:pPr>
+              <w:rPr>
+                <w:b/>
+                <w:bCs/>
+              </w:rPr>
+            </w:pPr>
+            <w:r>
+              <w:rPr>
+                <w:b/>
+                <w:bCs/>
+              </w:rPr>
+              <w:t>Descripción</w:t>
+            </w:r>
+          </w:p>
+        </w:tc>
+      </w:tr>
+      <w:tr>
+        <w:tc>
+          <w:tcPr>
+            <w:tcW w:w="0" w:type="auto"/>
+            <w:hideMark/>
+          </w:tcPr>
+          <w:p>
+            <w:r>
+              <w:t>Nombre</w:t>
+            </w:r>
+          </w:p>
+        </w:tc>
+        <w:tc>
+          <w:tcPr>
+            <w:tcW w:w="0" w:type="auto"/>
+            <w:hideMark/>
+          </w:tcPr>
+          <w:p>
+            <w:r>
+              <w:t>Explorando la cultura con la web</w:t>
+            </w:r>
+          </w:p>
+        </w:tc>
+      </w:tr>
+      <w:tr>
+        <w:tc>
+          <w:tcPr>
+            <w:tcW w:w="0" w:type="auto"/>
+            <w:hideMark/>
+          </w:tcPr>
+          <w:p>
+            <w:r>
+              <w:t>Problema o necesidad</w:t>
+            </w:r>
+          </w:p>
+        </w:tc>
+        <w:tc>
+          <w:tcPr>
+            <w:tcW w:w="0" w:type="auto"/>
+            <w:hideMark/>
+          </w:tcPr>
+          <w:p>
+            <w:r>
+              <w:t>Este proyecto muestra cómo cambió la forma de jugar en la infanci</w:t>
+            </w:r>
+            <w:r>
+              <w:t>a</w:t>
+            </w:r>
+            <w:r>
+              <w:t xml:space="preserve"> a partir de entrevistas </w:t>
+            </w:r>
+            <w:r>
+              <w:t>realizadas a personas de diferentes generaciones</w:t>
+            </w:r>
+            <w:r>
+              <w:t>. El sitio busca preservar la memoria cultural de los juegos tradicionales, destacar su valor para la convivencia</w:t>
+            </w:r>
+            <w:r>
+              <w:t xml:space="preserve"> y</w:t>
+            </w:r>
+            <w:r>
+              <w:t xml:space="preserve"> la imaginación</w:t>
+            </w:r>
+            <w:r>
+              <w:t>.</w:t>
+            </w:r>
+          </w:p>
+        </w:tc>
+      </w:tr>
+      <w:tr>
+        <w:tc>
+          <w:tcPr>
+            <w:tcW w:w="0" w:type="auto"/>
+            <w:hideMark/>
+          </w:tcPr>
+          <w:p>
+            <w:r>
+              <w:lastRenderedPageBreak/>
+              <w:t>Tecnologías utilizadas</w:t>
+            </w:r>
+          </w:p>
+        </w:tc>
+        <w:tc>
+          <w:tcPr>
+            <w:tcW w:w="0" w:type="auto"/>
+            <w:hideMark/>
+          </w:tcPr>
+          <w:p>
+            <w:r>
+              <w:t>HTML5, CSS</w:t>
+            </w:r>
+            <w:r>
+              <w:t>,</w:t>
+            </w:r>
+            <w:r>
+              <w:t xml:space="preserve"> JavaScript</w:t>
+            </w:r>
+            <w:r>
+              <w:t xml:space="preserve">, </w:t>
+            </w:r>
+            <w:r>
+              <w:t xml:space="preserve">Google </w:t>
+            </w:r>
+            <w:proofErr w:type="spellStart"/>
+            <w:r>
+              <w:t>Maps</w:t>
+            </w:r>
+            <w:proofErr w:type="spellEnd"/>
+            <w:r>
+              <w:t xml:space="preserve"> (</w:t>
+            </w:r>
+            <w:proofErr w:type="spellStart"/>
+            <w:r>
+              <w:t>iframe</w:t>
+            </w:r>
+            <w:proofErr w:type="spellEnd"/>
+            <w:r>
+              <w:t xml:space="preserve"> incrustado</w:t>
+            </w:r>
+            <w:r>
+              <w:t>)</w:t>
+            </w:r>
+            <w:r>
+              <w:t xml:space="preserve">, </w:t>
+            </w:r>
+            <w:r>
+              <w:t>GitHub y GitHub Pages</w:t>
+            </w:r>
+            <w:r>
+              <w:t>.</w:t>
+            </w:r>
+          </w:p>
+        </w:tc>
+      </w:tr>
+      <w:tr>
+        <w:tc>
+          <w:tcPr>
+            <w:tcW w:w="0" w:type="auto"/>
+            <w:hideMark/>
+          </w:tcPr>
+          <w:p>
+            <w:r>
+              <w:t>Funcionalidades principales</w:t>
+            </w:r>
+          </w:p>
+        </w:tc>
+        <w:tc>
+          <w:tcPr>
+            <w:tcW w:w="0" w:type="auto"/>
+            <w:hideMark/>
+          </w:tcPr>
+          <w:p>
+            <w:r>
+              <w:t>Presentación de juegos tradicionales y actuales, comparación entre generaciones y exposición de experiencias y opiniones recopiladas mediante entrevistas.</w:t>
+            </w:r>
+          </w:p>
+        </w:tc>
+      </w:tr>
+      <w:tr>
+        <w:tc>
+          <w:tcPr>
+            <w:tcW w:w="0" w:type="auto"/>
+            <w:hideMark/>
+          </w:tcPr>
+          <w:p>
+            <w:r>
+              <w:t>Repositorio</w:t>
+            </w:r>
+          </w:p>
+        </w:tc>
+        <w:tc>
+          <w:tcPr>
+            <w:tcW w:w="0" w:type="auto"/>
+            <w:hideMark/>
+          </w:tcPr>
+          <w:p>
+            <w:hyperlink r:id="rId6" w:history="1">
+              <w:r>
+                <w:rPr>
+                  <w:rStyle w:val="Hipervnculo"/>
+                  <w:b/>
+                  <w:bCs/>
+                </w:rPr>
+                <w:t>Explorando-la-cultura-con-</w:t>
+              </w:r>
+              <w:r>
+                <w:rPr>
+                  <w:rStyle w:val="Hipervnculo"/>
+                  <w:b/>
+                  <w:bCs/>
+                </w:rPr>
+                <w:t>l</w:t>
+              </w:r>
+              <w:r>
+                <w:rPr>
+                  <w:rStyle w:val="Hipervnculo"/>
+                  <w:b/>
+                  <w:bCs/>
+                </w:rPr>
+                <w:t>a-web</w:t>
+              </w:r>
+            </w:hyperlink>
+          </w:p>
+        </w:tc>
+      </w:tr>
+      <w:tr>
+        <w:tc>
+          <w:tcPr>
+            <w:tcW w:w="0" w:type="auto"/>
+            <w:hideMark/>
+          </w:tcPr>
+          <w:p>
+            <w:r>
+              <w:t>Demostración</w:t>
+            </w:r>
+          </w:p>
+        </w:tc>
+        <w:tc>
+          <w:tcPr>
+            <w:tcW w:w="0" w:type="auto"/>
+            <w:hideMark/>
+          </w:tcPr>
+          <w:p>
+            <w:pPr>
+              <w:tabs>
+                <w:tab w:val="left" w:pos="1812"/>
+              </w:tabs>
+            </w:pPr>
+            <w:hyperlink r:id="rId7" w:history="1">
+              <w:r>
+                <w:rPr>
+                  <w:rStyle w:val="Hipervnculo"/>
+                </w:rPr>
+                <w:t>https://jacquelinecuenc</w:t>
+              </w:r>
+              <w:r>
+                <w:rPr>
+                  <w:rStyle w:val="Hipervnculo"/>
+                </w:rPr>
+                <w:t>a</w:t>
+              </w:r>
+              <w:r>
+                <w:rPr>
+                  <w:rStyle w:val="Hipervnculo"/>
+                </w:rPr>
+                <w:t>.github.io/Explorando-la-cultura-con-la-web/</w:t>
+              </w:r>
+            </w:hyperlink>
+            <w:r>
+              <w:t xml:space="preserve"> </w:t>
+            </w:r>
+          </w:p>
+        </w:tc>
+      </w:tr>
+    </w:tbl>
+    <w:p>
+      <w:pPr>
+        <w:rPr>
+          <w:lang w:val="es-MX"/>
+        </w:rPr>
+      </w:pPr>
+    </w:p>
+    <w:p>
+      <w:pPr>
+        <w:pStyle w:val="Prrafodelista"/>
+        <w:numPr>
+          <w:ilvl w:val="0"/>
+          <w:numId w:val="17"/>
+        </w:numPr>
+        <w:rPr>
+          <w:lang w:val="es-MX"/>
+        </w:rPr>
+      </w:pPr>
+      <w:r>
+        <w:rPr>
+          <w:b/>
+          <w:bCs/>
+          <w:lang w:val="es-MX"/>
+        </w:rPr>
+        <w:t>simulador-mundial-2026</w:t>
+      </w:r>
+    </w:p>
+    <w:tbl>
+      <w:tblPr>
+        <w:tblStyle w:val="Tablaconcuadrcula"/>
+        <w:tblW w:w="0" w:type="auto"/>
+        <w:tblLook w:val="04A0" w:firstRow="1" w:lastRow="0" w:firstColumn="1" w:lastColumn="0" w:noHBand="0" w:noVBand="1"/>
+      </w:tblPr>
+      <w:tblGrid>
+        <w:gridCol w:w="2072"/>
+        <w:gridCol w:w="6422"/>
+      </w:tblGrid>
+      <w:tr>
+        <w:tc>
+          <w:tcPr>
+            <w:tcW w:w="0" w:type="auto"/>
+            <w:hideMark/>
+          </w:tcPr>
+          <w:p>
+            <w:pPr>
+              <w:rPr>
+                <w:b/>
+                <w:bCs/>
+              </w:rPr>
+            </w:pPr>
+            <w:r>
+              <w:rPr>
+                <w:b/>
+                <w:bCs/>
+              </w:rPr>
+              <w:t>Característica</w:t>
+            </w:r>
+          </w:p>
+        </w:tc>
+        <w:tc>
+          <w:tcPr>
+            <w:tcW w:w="0" w:type="auto"/>
+            <w:hideMark/>
+          </w:tcPr>
+          <w:p>
+            <w:pPr>
+              <w:rPr>
+                <w:b/>
+                <w:bCs/>
+              </w:rPr>
+            </w:pPr>
+            <w:r>
+              <w:rPr>
+                <w:b/>
+                <w:bCs/>
+              </w:rPr>
+              <w:t>Descripción</w:t>
+            </w:r>
+          </w:p>
+        </w:tc>
+      </w:tr>
+      <w:tr>
+        <w:tc>
+          <w:tcPr>
+            <w:tcW w:w="0" w:type="auto"/>
+            <w:hideMark/>
+          </w:tcPr>
+          <w:p>
+            <w:r>
+              <w:t>Nombre</w:t>
+            </w:r>
+          </w:p>
+        </w:tc>
+        <w:tc>
+          <w:tcPr>
+            <w:tcW w:w="0" w:type="auto"/>
+            <w:hideMark/>
+          </w:tcPr>
+          <w:p>
+            <w:r>
+              <w:t>Simulador Mundial 2026</w:t>
+            </w:r>
+          </w:p>
+        </w:tc>
+      </w:tr>
+      <w:tr>
+        <w:tc>
+          <w:tcPr>
+            <w:tcW w:w="0" w:type="auto"/>
+            <w:hideMark/>
+          </w:tcPr>
+          <w:p>
+            <w:r>
+              <w:t>Problema o necesidad</w:t>
+            </w:r>
+          </w:p>
+        </w:tc>
+        <w:tc>
+          <w:tcPr>
+            <w:tcW w:w="0" w:type="auto"/>
+            <w:hideMark/>
+          </w:tcPr>
+          <w:p>
+            <w:r>
+              <w:t>S</w:t>
+            </w:r>
+            <w:r>
+              <w:t>imula la fase de grupos de un mundial: el usuario arma un grupo de 4 selecciones, el programa genera los resultados de los partidos al azar, calcula la tabla de posiciones y dice qué equipos pasan a la siguiente etapa.</w:t>
+            </w:r>
+          </w:p>
+        </w:tc>
+      </w:tr>
+      <w:tr>
+        <w:tc>
+          <w:tcPr>
+            <w:tcW w:w="0" w:type="auto"/>
+            <w:hideMark/>
+          </w:tcPr>
+          <w:p>
+            <w:r>
+              <w:t>Tecnologías utilizadas</w:t>
+            </w:r>
+          </w:p>
+        </w:tc>
+        <w:tc>
+          <w:tcPr>
+            <w:tcW w:w="0" w:type="auto"/>
+            <w:hideMark/>
+          </w:tcPr>
+          <w:p>
+            <w:r>
+              <w:t xml:space="preserve">Ensamblador MIPS32, </w:t>
+            </w:r>
+            <w:r>
+              <w:t>l</w:t>
+            </w:r>
+            <w:r>
+              <w:t>lamadas al sistema (</w:t>
+            </w:r>
+            <w:proofErr w:type="spellStart"/>
+            <w:r>
+              <w:t>syscall</w:t>
+            </w:r>
+            <w:proofErr w:type="spellEnd"/>
+            <w:r>
+              <w:t>)</w:t>
+            </w:r>
+            <w:r>
+              <w:t>, e</w:t>
+            </w:r>
+            <w:r>
+              <w:t xml:space="preserve">structuras de datos: arreglos de palabras, </w:t>
+            </w:r>
+            <w:proofErr w:type="gramStart"/>
+            <w:r>
+              <w:t>cadenas</w:t>
+            </w:r>
+            <w:r>
+              <w:t xml:space="preserve"> </w:t>
+            </w:r>
+            <w:r>
+              <w:t>.</w:t>
+            </w:r>
+            <w:proofErr w:type="spellStart"/>
+            <w:r>
+              <w:t>asciiz</w:t>
+            </w:r>
+            <w:proofErr w:type="spellEnd"/>
+            <w:proofErr w:type="gramEnd"/>
+            <w:r>
+              <w:t>, arreglos paralelos y la pila para guardar registros.</w:t>
+            </w:r>
+          </w:p>
+          <w:p>
+            <w:r>
+              <w:t xml:space="preserve">Algoritmos: </w:t>
+            </w:r>
+            <w:proofErr w:type="spellStart"/>
+            <w:r>
+              <w:t>Bubble</w:t>
+            </w:r>
+            <w:proofErr w:type="spellEnd"/>
+            <w:r>
+              <w:t xml:space="preserve"> Sort y comparación de cadenas</w:t>
+            </w:r>
+            <w:r>
+              <w:t>.</w:t>
+            </w:r>
+          </w:p>
+          <w:p/>
+        </w:tc>
+      </w:tr>
+      <w:tr>
+        <w:tc>
+          <w:tcPr>
+            <w:tcW w:w="0" w:type="auto"/>
+            <w:hideMark/>
+          </w:tcPr>
+          <w:p>
+            <w:r>
+              <w:t>Funcionalidades principales</w:t>
+            </w:r>
+          </w:p>
+        </w:tc>
+        <w:tc>
+          <w:tcPr>
+            <w:tcW w:w="0" w:type="auto"/>
+            <w:hideMark/>
+          </w:tcPr>
+          <w:p>
+            <w:r>
+              <w:t>Gestión de equipos, simulación de partidos con generación aleatoria de goles, actualización de resultados, generación de tablas de posiciones y clasificación de equipos.</w:t>
+            </w:r>
+          </w:p>
+        </w:tc>
+      </w:tr>
+      <w:tr>
+        <w:tc>
+          <w:tcPr>
+            <w:tcW w:w="0" w:type="auto"/>
+            <w:hideMark/>
+          </w:tcPr>
+          <w:p>
+            <w:r>
+              <w:t>Repositorio</w:t>
+            </w:r>
+          </w:p>
+        </w:tc>
+        <w:tc>
+          <w:tcPr>
+            <w:tcW w:w="0" w:type="auto"/>
+            <w:hideMark/>
+          </w:tcPr>
+          <w:p>
+            <w:hyperlink r:id="rId8" w:history="1">
+              <w:r>
+                <w:rPr>
+                  <w:rStyle w:val="Hipervnculo"/>
+                  <w:b/>
+                  <w:bCs/>
+                </w:rPr>
+                <w:t>simulador-mundia</w:t>
+              </w:r>
+              <w:r>
+                <w:rPr>
+                  <w:rStyle w:val="Hipervnculo"/>
+                  <w:b/>
+                  <w:bCs/>
+                </w:rPr>
+                <w:t>l</w:t>
+              </w:r>
+              <w:r>
+                <w:rPr>
+                  <w:rStyle w:val="Hipervnculo"/>
+                  <w:b/>
+                  <w:bCs/>
+                </w:rPr>
+                <w:t>-2026</w:t>
+              </w:r>
+            </w:hyperlink>
+          </w:p>
+        </w:tc>
+      </w:tr>
+      <w:tr>
+        <w:tc>
+          <w:tcPr>
+            <w:tcW w:w="0" w:type="auto"/>
+            <w:hideMark/>
+          </w:tcPr>
+          <w:p>
+            <w:r>
+              <w:t>Demostración</w:t>
+            </w:r>
+          </w:p>
+        </w:tc>
+        <w:tc>
+          <w:tcPr>
+            <w:tcW w:w="0" w:type="auto"/>
+            <w:hideMark/>
+          </w:tcPr>
+          <w:p>
+            <w:r>
+              <w:t xml:space="preserve">No </w:t>
+            </w:r>
+            <w:r>
+              <w:t>existe</w:t>
+            </w:r>
+            <w:r>
+              <w:t>.</w:t>
+            </w:r>
+          </w:p>
         </w:tc>
       </w:tr>
     </w:tbl>
@@ -671,6 +1429,119 @@
     </w:lvl>
   </w:abstractNum>
   <w:abstractNum w:abstractNumId="1" w15:restartNumberingAfterBreak="0">
+    <w:nsid w:val="04141010"/>
+    <w:multiLevelType w:val="hybridMultilevel"/>
+    <w:tmpl w:val="CF72D4DA"/>
+    <w:lvl w:ilvl="0" w:tplc="580A0001">
+      <w:start w:val="1"/>
+      <w:numFmt w:val="bullet"/>
+      <w:lvlText w:val=""/>
+      <w:lvlJc w:val="left"/>
+      <w:pPr>
+        <w:ind w:left="720" w:hanging="360"/>
+      </w:pPr>
+      <w:rPr>
+        <w:rFonts w:ascii="Symbol" w:hAnsi="Symbol" w:hint="default"/>
+      </w:rPr>
+    </w:lvl>
+    <w:lvl w:ilvl="1" w:tplc="580A0003" w:tentative="1">
+      <w:start w:val="1"/>
+      <w:numFmt w:val="bullet"/>
+      <w:lvlText w:val="o"/>
+      <w:lvlJc w:val="left"/>
+      <w:pPr>
+        <w:ind w:left="1440" w:hanging="360"/>
+      </w:pPr>
+      <w:rPr>
+        <w:rFonts w:ascii="Courier New" w:hAnsi="Courier New" w:cs="Courier New" w:hint="default"/>
+      </w:rPr>
+    </w:lvl>
+    <w:lvl w:ilvl="2" w:tplc="580A0005" w:tentative="1">
+      <w:start w:val="1"/>
+      <w:numFmt w:val="bullet"/>
+      <w:lvlText w:val=""/>
+      <w:lvlJc w:val="left"/>
+      <w:pPr>
+        <w:ind w:left="2160" w:hanging="360"/>
+      </w:pPr>
+      <w:rPr>
+        <w:rFonts w:ascii="Wingdings" w:hAnsi="Wingdings" w:hint="default"/>
+      </w:rPr>
+    </w:lvl>
+    <w:lvl w:ilvl="3" w:tplc="580A0001" w:tentative="1">
+      <w:start w:val="1"/>
+      <w:numFmt w:val="bullet"/>
+      <w:lvlText w:val=""/>
+      <w:lvlJc w:val="left"/>
+      <w:pPr>
+        <w:ind w:left="2880" w:hanging="360"/>
+      </w:pPr>
+      <w:rPr>
+        <w:rFonts w:ascii="Symbol" w:hAnsi="Symbol" w:hint="default"/>
+      </w:rPr>
+    </w:lvl>
+    <w:lvl w:ilvl="4" w:tplc="580A0003" w:tentative="1">
+      <w:start w:val="1"/>
+      <w:numFmt w:val="bullet"/>
+      <w:lvlText w:val="o"/>
+      <w:lvlJc w:val="left"/>
+      <w:pPr>
+        <w:ind w:left="3600" w:hanging="360"/>
+      </w:pPr>
+      <w:rPr>
+        <w:rFonts w:ascii="Courier New" w:hAnsi="Courier New" w:cs="Courier New" w:hint="default"/>
+      </w:rPr>
+    </w:lvl>
+    <w:lvl w:ilvl="5" w:tplc="580A0005" w:tentative="1">
+      <w:start w:val="1"/>
+      <w:numFmt w:val="bullet"/>
+      <w:lvlText w:val=""/>
+      <w:lvlJc w:val="left"/>
+      <w:pPr>
+        <w:ind w:left="4320" w:hanging="360"/>
+      </w:pPr>
+      <w:rPr>
+        <w:rFonts w:ascii="Wingdings" w:hAnsi="Wingdings" w:hint="default"/>
+      </w:rPr>
+    </w:lvl>
+    <w:lvl w:ilvl="6" w:tplc="580A0001" w:tentative="1">
+      <w:start w:val="1"/>
+      <w:numFmt w:val="bullet"/>
+      <w:lvlText w:val=""/>
+      <w:lvlJc w:val="left"/>
+      <w:pPr>
+        <w:ind w:left="5040" w:hanging="360"/>
+      </w:pPr>
+      <w:rPr>
+        <w:rFonts w:ascii="Symbol" w:hAnsi="Symbol" w:hint="default"/>
+      </w:rPr>
+    </w:lvl>
+    <w:lvl w:ilvl="7" w:tplc="580A0003" w:tentative="1">
+      <w:start w:val="1"/>
+      <w:numFmt w:val="bullet"/>
+      <w:lvlText w:val="o"/>
+      <w:lvlJc w:val="left"/>
+      <w:pPr>
+        <w:ind w:left="5760" w:hanging="360"/>
+      </w:pPr>
+      <w:rPr>
+        <w:rFonts w:ascii="Courier New" w:hAnsi="Courier New" w:cs="Courier New" w:hint="default"/>
+      </w:rPr>
+    </w:lvl>
+    <w:lvl w:ilvl="8" w:tplc="580A0005" w:tentative="1">
+      <w:start w:val="1"/>
+      <w:numFmt w:val="bullet"/>
+      <w:lvlText w:val=""/>
+      <w:lvlJc w:val="left"/>
+      <w:pPr>
+        <w:ind w:left="6480" w:hanging="360"/>
+      </w:pPr>
+      <w:rPr>
+        <w:rFonts w:ascii="Wingdings" w:hAnsi="Wingdings" w:hint="default"/>
+      </w:rPr>
+    </w:lvl>
+  </w:abstractNum>
+  <w:abstractNum w:abstractNumId="2" w15:restartNumberingAfterBreak="0">
     <w:nsid w:val="058A4006"/>
     <w:multiLevelType w:val="hybridMultilevel"/>
     <w:tmpl w:val="3650EA48"/>
@@ -759,7 +1630,119 @@
       </w:pPr>
     </w:lvl>
   </w:abstractNum>
-  <w:abstractNum w:abstractNumId="2" w15:restartNumberingAfterBreak="0">
+  <w:abstractNum w:abstractNumId="3" w15:restartNumberingAfterBreak="0">
+    <w:nsid w:val="109B4278"/>
+    <w:multiLevelType w:val="hybridMultilevel"/>
+    <w:tmpl w:val="0D782DF8"/>
+    <w:lvl w:ilvl="0" w:tplc="F1AE5ABE">
+      <w:numFmt w:val="bullet"/>
+      <w:lvlText w:val=""/>
+      <w:lvlJc w:val="left"/>
+      <w:pPr>
+        <w:ind w:left="720" w:hanging="360"/>
+      </w:pPr>
+      <w:rPr>
+        <w:rFonts w:ascii="Calibri" w:eastAsiaTheme="minorHAnsi" w:hAnsi="Calibri" w:cs="Calibri" w:hint="default"/>
+      </w:rPr>
+    </w:lvl>
+    <w:lvl w:ilvl="1" w:tplc="580A0003" w:tentative="1">
+      <w:start w:val="1"/>
+      <w:numFmt w:val="bullet"/>
+      <w:lvlText w:val="o"/>
+      <w:lvlJc w:val="left"/>
+      <w:pPr>
+        <w:ind w:left="1440" w:hanging="360"/>
+      </w:pPr>
+      <w:rPr>
+        <w:rFonts w:ascii="Courier New" w:hAnsi="Courier New" w:cs="Courier New" w:hint="default"/>
+      </w:rPr>
+    </w:lvl>
+    <w:lvl w:ilvl="2" w:tplc="580A0005" w:tentative="1">
+      <w:start w:val="1"/>
+      <w:numFmt w:val="bullet"/>
+      <w:lvlText w:val=""/>
+      <w:lvlJc w:val="left"/>
+      <w:pPr>
+        <w:ind w:left="2160" w:hanging="360"/>
+      </w:pPr>
+      <w:rPr>
+        <w:rFonts w:ascii="Wingdings" w:hAnsi="Wingdings" w:hint="default"/>
+      </w:rPr>
+    </w:lvl>
+    <w:lvl w:ilvl="3" w:tplc="580A0001" w:tentative="1">
+      <w:start w:val="1"/>
+      <w:numFmt w:val="bullet"/>
+      <w:lvlText w:val=""/>
+      <w:lvlJc w:val="left"/>
+      <w:pPr>
+        <w:ind w:left="2880" w:hanging="360"/>
+      </w:pPr>
+      <w:rPr>
+        <w:rFonts w:ascii="Symbol" w:hAnsi="Symbol" w:hint="default"/>
+      </w:rPr>
+    </w:lvl>
+    <w:lvl w:ilvl="4" w:tplc="580A0003" w:tentative="1">
+      <w:start w:val="1"/>
+      <w:numFmt w:val="bullet"/>
+      <w:lvlText w:val="o"/>
+      <w:lvlJc w:val="left"/>
+      <w:pPr>
+        <w:ind w:left="3600" w:hanging="360"/>
+      </w:pPr>
+      <w:rPr>
+        <w:rFonts w:ascii="Courier New" w:hAnsi="Courier New" w:cs="Courier New" w:hint="default"/>
+      </w:rPr>
+    </w:lvl>
+    <w:lvl w:ilvl="5" w:tplc="580A0005" w:tentative="1">
+      <w:start w:val="1"/>
+      <w:numFmt w:val="bullet"/>
+      <w:lvlText w:val=""/>
+      <w:lvlJc w:val="left"/>
+      <w:pPr>
+        <w:ind w:left="4320" w:hanging="360"/>
+      </w:pPr>
+      <w:rPr>
+        <w:rFonts w:ascii="Wingdings" w:hAnsi="Wingdings" w:hint="default"/>
+      </w:rPr>
+    </w:lvl>
+    <w:lvl w:ilvl="6" w:tplc="580A0001" w:tentative="1">
+      <w:start w:val="1"/>
+      <w:numFmt w:val="bullet"/>
+      <w:lvlText w:val=""/>
+      <w:lvlJc w:val="left"/>
+      <w:pPr>
+        <w:ind w:left="5040" w:hanging="360"/>
+      </w:pPr>
+      <w:rPr>
+        <w:rFonts w:ascii="Symbol" w:hAnsi="Symbol" w:hint="default"/>
+      </w:rPr>
+    </w:lvl>
+    <w:lvl w:ilvl="7" w:tplc="580A0003" w:tentative="1">
+      <w:start w:val="1"/>
+      <w:numFmt w:val="bullet"/>
+      <w:lvlText w:val="o"/>
+      <w:lvlJc w:val="left"/>
+      <w:pPr>
+        <w:ind w:left="5760" w:hanging="360"/>
+      </w:pPr>
+      <w:rPr>
+        <w:rFonts w:ascii="Courier New" w:hAnsi="Courier New" w:cs="Courier New" w:hint="default"/>
+      </w:rPr>
+    </w:lvl>
+    <w:lvl w:ilvl="8" w:tplc="580A0005" w:tentative="1">
+      <w:start w:val="1"/>
+      <w:numFmt w:val="bullet"/>
+      <w:lvlText w:val=""/>
+      <w:lvlJc w:val="left"/>
+      <w:pPr>
+        <w:ind w:left="6480" w:hanging="360"/>
+      </w:pPr>
+      <w:rPr>
+        <w:rFonts w:ascii="Wingdings" w:hAnsi="Wingdings" w:hint="default"/>
+      </w:rPr>
+    </w:lvl>
+  </w:abstractNum>
+  <w:abstractNum w:abstractNumId="4" w15:restartNumberingAfterBreak="0">
     <w:nsid w:val="131E2662"/>
     <w:multiLevelType w:val="multilevel"/>
     <w:tmpl w:val="8176EFBA"/>
@@ -908,7 +1891,7 @@
       </w:rPr>
     </w:lvl>
   </w:abstractNum>
-  <w:abstractNum w:abstractNumId="3" w15:restartNumberingAfterBreak="0">
+  <w:abstractNum w:abstractNumId="5" w15:restartNumberingAfterBreak="0">
     <w:nsid w:val="14D1554B"/>
     <w:multiLevelType w:val="multilevel"/>
     <w:tmpl w:val="B27AA2F4"/>
@@ -1057,7 +2040,7 @@
       </w:rPr>
     </w:lvl>
   </w:abstractNum>
-  <w:abstractNum w:abstractNumId="4" w15:restartNumberingAfterBreak="0">
+  <w:abstractNum w:abstractNumId="6" w15:restartNumberingAfterBreak="0">
     <w:nsid w:val="18F81BDD"/>
     <w:multiLevelType w:val="multilevel"/>
     <w:tmpl w:val="6060CCCC"/>
@@ -1206,7 +2189,120 @@
       </w:rPr>
     </w:lvl>
   </w:abstractNum>
-  <w:abstractNum w:abstractNumId="5" w15:restartNumberingAfterBreak="0">
+  <w:abstractNum w:abstractNumId="7" w15:restartNumberingAfterBreak="0">
+    <w:nsid w:val="1D092167"/>
+    <w:multiLevelType w:val="hybridMultilevel"/>
+    <w:tmpl w:val="356844C8"/>
+    <w:lvl w:ilvl="0" w:tplc="580A0001">
+      <w:start w:val="1"/>
+      <w:numFmt w:val="bullet"/>
+      <w:lvlText w:val=""/>
+      <w:lvlJc w:val="left"/>
+      <w:pPr>
+        <w:ind w:left="720" w:hanging="360"/>
+      </w:pPr>
+      <w:rPr>
+        <w:rFonts w:ascii="Symbol" w:hAnsi="Symbol" w:hint="default"/>
+      </w:rPr>
+    </w:lvl>
+    <w:lvl w:ilvl="1" w:tplc="580A0003" w:tentative="1">
+      <w:start w:val="1"/>
+      <w:numFmt w:val="bullet"/>
+      <w:lvlText w:val="o"/>
+      <w:lvlJc w:val="left"/>
+      <w:pPr>
+        <w:ind w:left="1440" w:hanging="360"/>
+      </w:pPr>
+      <w:rPr>
+        <w:rFonts w:ascii="Courier New" w:hAnsi="Courier New" w:cs="Courier New" w:hint="default"/>
+      </w:rPr>
+    </w:lvl>
+    <w:lvl w:ilvl="2" w:tplc="580A0005" w:tentative="1">
+      <w:start w:val="1"/>
+      <w:numFmt w:val="bullet"/>
+      <w:lvlText w:val=""/>
+      <w:lvlJc w:val="left"/>
+      <w:pPr>
+        <w:ind w:left="2160" w:hanging="360"/>
+      </w:pPr>
+      <w:rPr>
+        <w:rFonts w:ascii="Wingdings" w:hAnsi="Wingdings" w:hint="default"/>
+      </w:rPr>
+    </w:lvl>
+    <w:lvl w:ilvl="3" w:tplc="580A0001" w:tentative="1">
+      <w:start w:val="1"/>
+      <w:numFmt w:val="bullet"/>
+      <w:lvlText w:val=""/>
+      <w:lvlJc w:val="left"/>
+      <w:pPr>
+        <w:ind w:left="2880" w:hanging="360"/>
+      </w:pPr>
+      <w:rPr>
+        <w:rFonts w:ascii="Symbol" w:hAnsi="Symbol" w:hint="default"/>
+      </w:rPr>
+    </w:lvl>
+    <w:lvl w:ilvl="4" w:tplc="580A0003" w:tentative="1">
+      <w:start w:val="1"/>
+      <w:numFmt w:val="bullet"/>
+      <w:lvlText w:val="o"/>
+      <w:lvlJc w:val="left"/>
+      <w:pPr>
+        <w:ind w:left="3600" w:hanging="360"/>
+      </w:pPr>
+      <w:rPr>
+        <w:rFonts w:ascii="Courier New" w:hAnsi="Courier New" w:cs="Courier New" w:hint="default"/>
+      </w:rPr>
+    </w:lvl>
+    <w:lvl w:ilvl="5" w:tplc="580A0005" w:tentative="1">
+      <w:start w:val="1"/>
+      <w:numFmt w:val="bullet"/>
+      <w:lvlText w:val=""/>
+      <w:lvlJc w:val="left"/>
+      <w:pPr>
+        <w:ind w:left="4320" w:hanging="360"/>
+      </w:pPr>
+      <w:rPr>
+        <w:rFonts w:ascii="Wingdings" w:hAnsi="Wingdings" w:hint="default"/>
+      </w:rPr>
+    </w:lvl>
+    <w:lvl w:ilvl="6" w:tplc="580A0001" w:tentative="1">
+      <w:start w:val="1"/>
+      <w:numFmt w:val="bullet"/>
+      <w:lvlText w:val=""/>
+      <w:lvlJc w:val="left"/>
+      <w:pPr>
+        <w:ind w:left="5040" w:hanging="360"/>
+      </w:pPr>
+      <w:rPr>
+        <w:rFonts w:ascii="Symbol" w:hAnsi="Symbol" w:hint="default"/>
+      </w:rPr>
+    </w:lvl>
+    <w:lvl w:ilvl="7" w:tplc="580A0003" w:tentative="1">
+      <w:start w:val="1"/>
+      <w:numFmt w:val="bullet"/>
+      <w:lvlText w:val="o"/>
+      <w:lvlJc w:val="left"/>
+      <w:pPr>
+        <w:ind w:left="5760" w:hanging="360"/>
+      </w:pPr>
+      <w:rPr>
+        <w:rFonts w:ascii="Courier New" w:hAnsi="Courier New" w:cs="Courier New" w:hint="default"/>
+      </w:rPr>
+    </w:lvl>
+    <w:lvl w:ilvl="8" w:tplc="580A0005" w:tentative="1">
+      <w:start w:val="1"/>
+      <w:numFmt w:val="bullet"/>
+      <w:lvlText w:val=""/>
+      <w:lvlJc w:val="left"/>
+      <w:pPr>
+        <w:ind w:left="6480" w:hanging="360"/>
+      </w:pPr>
+      <w:rPr>
+        <w:rFonts w:ascii="Wingdings" w:hAnsi="Wingdings" w:hint="default"/>
+      </w:rPr>
+    </w:lvl>
+  </w:abstractNum>
+  <w:abstractNum w:abstractNumId="8" w15:restartNumberingAfterBreak="0">
     <w:nsid w:val="32E24B2C"/>
     <w:multiLevelType w:val="multilevel"/>
     <w:tmpl w:val="265C0ADE"/>
@@ -1355,7 +2451,7 @@
       </w:rPr>
     </w:lvl>
   </w:abstractNum>
-  <w:abstractNum w:abstractNumId="6" w15:restartNumberingAfterBreak="0">
+  <w:abstractNum w:abstractNumId="9" w15:restartNumberingAfterBreak="0">
     <w:nsid w:val="477F1F8C"/>
     <w:multiLevelType w:val="multilevel"/>
     <w:tmpl w:val="C79C3D82"/>
@@ -1504,7 +2600,156 @@
       </w:rPr>
     </w:lvl>
   </w:abstractNum>
-  <w:abstractNum w:abstractNumId="7" w15:restartNumberingAfterBreak="0">
+  <w:abstractNum w:abstractNumId="10" w15:restartNumberingAfterBreak="0">
+    <w:nsid w:val="4F7A34E8"/>
+    <w:multiLevelType w:val="multilevel"/>
+    <w:tmpl w:val="C6288898"/>
+    <w:lvl w:ilvl="0">
+      <w:start w:val="1"/>
+      <w:numFmt w:val="bullet"/>
+      <w:lvlText w:val=""/>
+      <w:lvlJc w:val="left"/>
+      <w:pPr>
+        <w:tabs>
+          <w:tab w:val="num" w:pos="720"/>
+        </w:tabs>
+        <w:ind w:left="720" w:hanging="360"/>
+      </w:pPr>
+      <w:rPr>
+        <w:rFonts w:ascii="Symbol" w:hAnsi="Symbol" w:hint="default"/>
+        <w:sz w:val="20"/>
+      </w:rPr>
+    </w:lvl>
+    <w:lvl w:ilvl="1" w:tentative="1">
+      <w:start w:val="1"/>
+      <w:numFmt w:val="bullet"/>
+      <w:lvlText w:val="o"/>
+      <w:lvlJc w:val="left"/>
+      <w:pPr>
+        <w:tabs>
+          <w:tab w:val="num" w:pos="1440"/>
+        </w:tabs>
+        <w:ind w:left="1440" w:hanging="360"/>
+      </w:pPr>
+      <w:rPr>
+        <w:rFonts w:ascii="Courier New" w:hAnsi="Courier New" w:hint="default"/>
+        <w:sz w:val="20"/>
+      </w:rPr>
+    </w:lvl>
+    <w:lvl w:ilvl="2" w:tentative="1">
+      <w:start w:val="1"/>
+      <w:numFmt w:val="bullet"/>
+      <w:lvlText w:val=""/>
+      <w:lvlJc w:val="left"/>
+      <w:pPr>
+        <w:tabs>
+          <w:tab w:val="num" w:pos="2160"/>
+        </w:tabs>
+        <w:ind w:left="2160" w:hanging="360"/>
+      </w:pPr>
+      <w:rPr>
+        <w:rFonts w:ascii="Wingdings" w:hAnsi="Wingdings" w:hint="default"/>
+        <w:sz w:val="20"/>
+      </w:rPr>
+    </w:lvl>
+    <w:lvl w:ilvl="3" w:tentative="1">
+      <w:start w:val="1"/>
+      <w:numFmt w:val="bullet"/>
+      <w:lvlText w:val=""/>
+      <w:lvlJc w:val="left"/>
+      <w:pPr>
+        <w:tabs>
+          <w:tab w:val="num" w:pos="2880"/>
+        </w:tabs>
+        <w:ind w:left="2880" w:hanging="360"/>
+      </w:pPr>
+      <w:rPr>
+        <w:rFonts w:ascii="Wingdings" w:hAnsi="Wingdings" w:hint="default"/>
+        <w:sz w:val="20"/>
+      </w:rPr>
+    </w:lvl>
+    <w:lvl w:ilvl="4" w:tentative="1">
+      <w:start w:val="1"/>
+      <w:numFmt w:val="bullet"/>
+      <w:lvlText w:val=""/>
+      <w:lvlJc w:val="left"/>
+      <w:pPr>
+        <w:tabs>
+          <w:tab w:val="num" w:pos="3600"/>
+        </w:tabs>
+        <w:ind w:left="3600" w:hanging="360"/>
+      </w:pPr>
+      <w:rPr>
+        <w:rFonts w:ascii="Wingdings" w:hAnsi="Wingdings" w:hint="default"/>
+        <w:sz w:val="20"/>
+      </w:rPr>
+    </w:lvl>
+    <w:lvl w:ilvl="5" w:tentative="1">
+      <w:start w:val="1"/>
+      <w:numFmt w:val="bullet"/>
+      <w:lvlText w:val=""/>
+      <w:lvlJc w:val="left"/>
+      <w:pPr>
+        <w:tabs>
+          <w:tab w:val="num" w:pos="4320"/>
+        </w:tabs>
+        <w:ind w:left="4320" w:hanging="360"/>
+      </w:pPr>
+      <w:rPr>
+        <w:rFonts w:ascii="Wingdings" w:hAnsi="Wingdings" w:hint="default"/>
+        <w:sz w:val="20"/>
+      </w:rPr>
+    </w:lvl>
+    <w:lvl w:ilvl="6" w:tentative="1">
+      <w:start w:val="1"/>
+      <w:numFmt w:val="bullet"/>
+      <w:lvlText w:val=""/>
+      <w:lvlJc w:val="left"/>
+      <w:pPr>
+        <w:tabs>
+          <w:tab w:val="num" w:pos="5040"/>
+        </w:tabs>
+        <w:ind w:left="5040" w:hanging="360"/>
+      </w:pPr>
+      <w:rPr>
+        <w:rFonts w:ascii="Wingdings" w:hAnsi="Wingdings" w:hint="default"/>
+        <w:sz w:val="20"/>
+      </w:rPr>
+    </w:lvl>
+    <w:lvl w:ilvl="7" w:tentative="1">
+      <w:start w:val="1"/>
+      <w:numFmt w:val="bullet"/>
+      <w:lvlText w:val=""/>
+      <w:lvlJc w:val="left"/>
+      <w:pPr>
+        <w:tabs>
+          <w:tab w:val="num" w:pos="5760"/>
+        </w:tabs>
+        <w:ind w:left="5760" w:hanging="360"/>
+      </w:pPr>
+      <w:rPr>
+        <w:rFonts w:ascii="Wingdings" w:hAnsi="Wingdings" w:hint="default"/>
+        <w:sz w:val="20"/>
+      </w:rPr>
+    </w:lvl>
+    <w:lvl w:ilvl="8" w:tentative="1">
+      <w:start w:val="1"/>
+      <w:numFmt w:val="bullet"/>
+      <w:lvlText w:val=""/>
+      <w:lvlJc w:val="left"/>
+      <w:pPr>
+        <w:tabs>
+          <w:tab w:val="num" w:pos="6480"/>
+        </w:tabs>
+        <w:ind w:left="6480" w:hanging="360"/>
+      </w:pPr>
+      <w:rPr>
+        <w:rFonts w:ascii="Wingdings" w:hAnsi="Wingdings" w:hint="default"/>
+        <w:sz w:val="20"/>
+      </w:rPr>
+    </w:lvl>
+  </w:abstractNum>
+  <w:abstractNum w:abstractNumId="11" w15:restartNumberingAfterBreak="0">
     <w:nsid w:val="5B1F6BFA"/>
     <w:multiLevelType w:val="multilevel"/>
     <w:tmpl w:val="4A868EC0"/>
@@ -1653,7 +2898,120 @@
       </w:rPr>
     </w:lvl>
   </w:abstractNum>
-  <w:abstractNum w:abstractNumId="8" w15:restartNumberingAfterBreak="0">
+  <w:abstractNum w:abstractNumId="12" w15:restartNumberingAfterBreak="0">
+    <w:nsid w:val="5CF560F0"/>
+    <w:multiLevelType w:val="hybridMultilevel"/>
+    <w:tmpl w:val="4FEA54D8"/>
+    <w:lvl w:ilvl="0" w:tplc="580A0001">
+      <w:start w:val="1"/>
+      <w:numFmt w:val="bullet"/>
+      <w:lvlText w:val=""/>
+      <w:lvlJc w:val="left"/>
+      <w:pPr>
+        <w:ind w:left="720" w:hanging="360"/>
+      </w:pPr>
+      <w:rPr>
+        <w:rFonts w:ascii="Symbol" w:hAnsi="Symbol" w:hint="default"/>
+      </w:rPr>
+    </w:lvl>
+    <w:lvl w:ilvl="1" w:tplc="580A0003" w:tentative="1">
+      <w:start w:val="1"/>
+      <w:numFmt w:val="bullet"/>
+      <w:lvlText w:val="o"/>
+      <w:lvlJc w:val="left"/>
+      <w:pPr>
+        <w:ind w:left="1440" w:hanging="360"/>
+      </w:pPr>
+      <w:rPr>
+        <w:rFonts w:ascii="Courier New" w:hAnsi="Courier New" w:cs="Courier New" w:hint="default"/>
+      </w:rPr>
+    </w:lvl>
+    <w:lvl w:ilvl="2" w:tplc="580A0005" w:tentative="1">
+      <w:start w:val="1"/>
+      <w:numFmt w:val="bullet"/>
+      <w:lvlText w:val=""/>
+      <w:lvlJc w:val="left"/>
+      <w:pPr>
+        <w:ind w:left="2160" w:hanging="360"/>
+      </w:pPr>
+      <w:rPr>
+        <w:rFonts w:ascii="Wingdings" w:hAnsi="Wingdings" w:hint="default"/>
+      </w:rPr>
+    </w:lvl>
+    <w:lvl w:ilvl="3" w:tplc="580A0001" w:tentative="1">
+      <w:start w:val="1"/>
+      <w:numFmt w:val="bullet"/>
+      <w:lvlText w:val=""/>
+      <w:lvlJc w:val="left"/>
+      <w:pPr>
+        <w:ind w:left="2880" w:hanging="360"/>
+      </w:pPr>
+      <w:rPr>
+        <w:rFonts w:ascii="Symbol" w:hAnsi="Symbol" w:hint="default"/>
+      </w:rPr>
+    </w:lvl>
+    <w:lvl w:ilvl="4" w:tplc="580A0003" w:tentative="1">
+      <w:start w:val="1"/>
+      <w:numFmt w:val="bullet"/>
+      <w:lvlText w:val="o"/>
+      <w:lvlJc w:val="left"/>
+      <w:pPr>
+        <w:ind w:left="3600" w:hanging="360"/>
+      </w:pPr>
+      <w:rPr>
+        <w:rFonts w:ascii="Courier New" w:hAnsi="Courier New" w:cs="Courier New" w:hint="default"/>
+      </w:rPr>
+    </w:lvl>
+    <w:lvl w:ilvl="5" w:tplc="580A0005" w:tentative="1">
+      <w:start w:val="1"/>
+      <w:numFmt w:val="bullet"/>
+      <w:lvlText w:val=""/>
+      <w:lvlJc w:val="left"/>
+      <w:pPr>
+        <w:ind w:left="4320" w:hanging="360"/>
+      </w:pPr>
+      <w:rPr>
+        <w:rFonts w:ascii="Wingdings" w:hAnsi="Wingdings" w:hint="default"/>
+      </w:rPr>
+    </w:lvl>
+    <w:lvl w:ilvl="6" w:tplc="580A0001" w:tentative="1">
+      <w:start w:val="1"/>
+      <w:numFmt w:val="bullet"/>
+      <w:lvlText w:val=""/>
+      <w:lvlJc w:val="left"/>
+      <w:pPr>
+        <w:ind w:left="5040" w:hanging="360"/>
+      </w:pPr>
+      <w:rPr>
+        <w:rFonts w:ascii="Symbol" w:hAnsi="Symbol" w:hint="default"/>
+      </w:rPr>
+    </w:lvl>
+    <w:lvl w:ilvl="7" w:tplc="580A0003" w:tentative="1">
+      <w:start w:val="1"/>
+      <w:numFmt w:val="bullet"/>
+      <w:lvlText w:val="o"/>
+      <w:lvlJc w:val="left"/>
+      <w:pPr>
+        <w:ind w:left="5760" w:hanging="360"/>
+      </w:pPr>
+      <w:rPr>
+        <w:rFonts w:ascii="Courier New" w:hAnsi="Courier New" w:cs="Courier New" w:hint="default"/>
+      </w:rPr>
+    </w:lvl>
+    <w:lvl w:ilvl="8" w:tplc="580A0005" w:tentative="1">
+      <w:start w:val="1"/>
+      <w:numFmt w:val="bullet"/>
+      <w:lvlText w:val=""/>
+      <w:lvlJc w:val="left"/>
+      <w:pPr>
+        <w:ind w:left="6480" w:hanging="360"/>
+      </w:pPr>
+      <w:rPr>
+        <w:rFonts w:ascii="Wingdings" w:hAnsi="Wingdings" w:hint="default"/>
+      </w:rPr>
+    </w:lvl>
+  </w:abstractNum>
+  <w:abstractNum w:abstractNumId="13" w15:restartNumberingAfterBreak="0">
     <w:nsid w:val="5D166E53"/>
     <w:multiLevelType w:val="multilevel"/>
     <w:tmpl w:val="57EED548"/>
@@ -1802,7 +3160,232 @@
       </w:rPr>
     </w:lvl>
   </w:abstractNum>
-  <w:abstractNum w:abstractNumId="9" w15:restartNumberingAfterBreak="0">
+  <w:abstractNum w:abstractNumId="14" w15:restartNumberingAfterBreak="0">
+    <w:nsid w:val="5F45235F"/>
+    <w:multiLevelType w:val="hybridMultilevel"/>
+    <w:tmpl w:val="3FB43E8E"/>
+    <w:lvl w:ilvl="0" w:tplc="580A0001">
+      <w:start w:val="1"/>
+      <w:numFmt w:val="bullet"/>
+      <w:lvlText w:val=""/>
+      <w:lvlJc w:val="left"/>
+      <w:pPr>
+        <w:ind w:left="720" w:hanging="360"/>
+      </w:pPr>
+      <w:rPr>
+        <w:rFonts w:ascii="Symbol" w:hAnsi="Symbol" w:hint="default"/>
+      </w:rPr>
+    </w:lvl>
+    <w:lvl w:ilvl="1" w:tplc="580A0003" w:tentative="1">
+      <w:start w:val="1"/>
+      <w:numFmt w:val="bullet"/>
+      <w:lvlText w:val="o"/>
+      <w:lvlJc w:val="left"/>
+      <w:pPr>
+        <w:ind w:left="1440" w:hanging="360"/>
+      </w:pPr>
+      <w:rPr>
+        <w:rFonts w:ascii="Courier New" w:hAnsi="Courier New" w:cs="Courier New" w:hint="default"/>
+      </w:rPr>
+    </w:lvl>
+    <w:lvl w:ilvl="2" w:tplc="580A0005" w:tentative="1">
+      <w:start w:val="1"/>
+      <w:numFmt w:val="bullet"/>
+      <w:lvlText w:val=""/>
+      <w:lvlJc w:val="left"/>
+      <w:pPr>
+        <w:ind w:left="2160" w:hanging="360"/>
+      </w:pPr>
+      <w:rPr>
+        <w:rFonts w:ascii="Wingdings" w:hAnsi="Wingdings" w:hint="default"/>
+      </w:rPr>
+    </w:lvl>
+    <w:lvl w:ilvl="3" w:tplc="580A0001" w:tentative="1">
+      <w:start w:val="1"/>
+      <w:numFmt w:val="bullet"/>
+      <w:lvlText w:val=""/>
+      <w:lvlJc w:val="left"/>
+      <w:pPr>
+        <w:ind w:left="2880" w:hanging="360"/>
+      </w:pPr>
+      <w:rPr>
+        <w:rFonts w:ascii="Symbol" w:hAnsi="Symbol" w:hint="default"/>
+      </w:rPr>
+    </w:lvl>
+    <w:lvl w:ilvl="4" w:tplc="580A0003" w:tentative="1">
+      <w:start w:val="1"/>
+      <w:numFmt w:val="bullet"/>
+      <w:lvlText w:val="o"/>
+      <w:lvlJc w:val="left"/>
+      <w:pPr>
+        <w:ind w:left="3600" w:hanging="360"/>
+      </w:pPr>
+      <w:rPr>
+        <w:rFonts w:ascii="Courier New" w:hAnsi="Courier New" w:cs="Courier New" w:hint="default"/>
+      </w:rPr>
+    </w:lvl>
+    <w:lvl w:ilvl="5" w:tplc="580A0005" w:tentative="1">
+      <w:start w:val="1"/>
+      <w:numFmt w:val="bullet"/>
+      <w:lvlText w:val=""/>
+      <w:lvlJc w:val="left"/>
+      <w:pPr>
+        <w:ind w:left="4320" w:hanging="360"/>
+      </w:pPr>
+      <w:rPr>
+        <w:rFonts w:ascii="Wingdings" w:hAnsi="Wingdings" w:hint="default"/>
+      </w:rPr>
+    </w:lvl>
+    <w:lvl w:ilvl="6" w:tplc="580A0001" w:tentative="1">
+      <w:start w:val="1"/>
+      <w:numFmt w:val="bullet"/>
+      <w:lvlText w:val=""/>
+      <w:lvlJc w:val="left"/>
+      <w:pPr>
+        <w:ind w:left="5040" w:hanging="360"/>
+      </w:pPr>
+      <w:rPr>
+        <w:rFonts w:ascii="Symbol" w:hAnsi="Symbol" w:hint="default"/>
+      </w:rPr>
+    </w:lvl>
+    <w:lvl w:ilvl="7" w:tplc="580A0003" w:tentative="1">
+      <w:start w:val="1"/>
+      <w:numFmt w:val="bullet"/>
+      <w:lvlText w:val="o"/>
+      <w:lvlJc w:val="left"/>
+      <w:pPr>
+        <w:ind w:left="5760" w:hanging="360"/>
+      </w:pPr>
+      <w:rPr>
+        <w:rFonts w:ascii="Courier New" w:hAnsi="Courier New" w:cs="Courier New" w:hint="default"/>
+      </w:rPr>
+    </w:lvl>
+    <w:lvl w:ilvl="8" w:tplc="580A0005" w:tentative="1">
+      <w:start w:val="1"/>
+      <w:numFmt w:val="bullet"/>
+      <w:lvlText w:val=""/>
+      <w:lvlJc w:val="left"/>
+      <w:pPr>
+        <w:ind w:left="6480" w:hanging="360"/>
+      </w:pPr>
+      <w:rPr>
+        <w:rFonts w:ascii="Wingdings" w:hAnsi="Wingdings" w:hint="default"/>
+      </w:rPr>
+    </w:lvl>
+  </w:abstractNum>
+  <w:abstractNum w:abstractNumId="15" w15:restartNumberingAfterBreak="0">
+    <w:nsid w:val="61D5736B"/>
+    <w:multiLevelType w:val="hybridMultilevel"/>
+    <w:tmpl w:val="BE044F78"/>
+    <w:lvl w:ilvl="0" w:tplc="F1AE5ABE">
+      <w:numFmt w:val="bullet"/>
+      <w:lvlText w:val=""/>
+      <w:lvlJc w:val="left"/>
+      <w:pPr>
+        <w:ind w:left="720" w:hanging="360"/>
+      </w:pPr>
+      <w:rPr>
+        <w:rFonts w:ascii="Calibri" w:eastAsiaTheme="minorHAnsi" w:hAnsi="Calibri" w:cs="Calibri" w:hint="default"/>
+      </w:rPr>
+    </w:lvl>
+    <w:lvl w:ilvl="1" w:tplc="580A0003" w:tentative="1">
+      <w:start w:val="1"/>
+      <w:numFmt w:val="bullet"/>
+      <w:lvlText w:val="o"/>
+      <w:lvlJc w:val="left"/>
+      <w:pPr>
+        <w:ind w:left="1440" w:hanging="360"/>
+      </w:pPr>
+      <w:rPr>
+        <w:rFonts w:ascii="Courier New" w:hAnsi="Courier New" w:cs="Courier New" w:hint="default"/>
+      </w:rPr>
+    </w:lvl>
+    <w:lvl w:ilvl="2" w:tplc="580A0005" w:tentative="1">
+      <w:start w:val="1"/>
+      <w:numFmt w:val="bullet"/>
+      <w:lvlText w:val=""/>
+      <w:lvlJc w:val="left"/>
+      <w:pPr>
+        <w:ind w:left="2160" w:hanging="360"/>
+      </w:pPr>
+      <w:rPr>
+        <w:rFonts w:ascii="Wingdings" w:hAnsi="Wingdings" w:hint="default"/>
+      </w:rPr>
+    </w:lvl>
+    <w:lvl w:ilvl="3" w:tplc="580A0001" w:tentative="1">
+      <w:start w:val="1"/>
+      <w:numFmt w:val="bullet"/>
+      <w:lvlText w:val=""/>
+      <w:lvlJc w:val="left"/>
+      <w:pPr>
+        <w:ind w:left="2880" w:hanging="360"/>
+      </w:pPr>
+      <w:rPr>
+        <w:rFonts w:ascii="Symbol" w:hAnsi="Symbol" w:hint="default"/>
+      </w:rPr>
+    </w:lvl>
+    <w:lvl w:ilvl="4" w:tplc="580A0003" w:tentative="1">
+      <w:start w:val="1"/>
+      <w:numFmt w:val="bullet"/>
+      <w:lvlText w:val="o"/>
+      <w:lvlJc w:val="left"/>
+      <w:pPr>
+        <w:ind w:left="3600" w:hanging="360"/>
+      </w:pPr>
+      <w:rPr>
+        <w:rFonts w:ascii="Courier New" w:hAnsi="Courier New" w:cs="Courier New" w:hint="default"/>
+      </w:rPr>
+    </w:lvl>
+    <w:lvl w:ilvl="5" w:tplc="580A0005" w:tentative="1">
+      <w:start w:val="1"/>
+      <w:numFmt w:val="bullet"/>
+      <w:lvlText w:val=""/>
+      <w:lvlJc w:val="left"/>
+      <w:pPr>
+        <w:ind w:left="4320" w:hanging="360"/>
+      </w:pPr>
+      <w:rPr>
+        <w:rFonts w:ascii="Wingdings" w:hAnsi="Wingdings" w:hint="default"/>
+      </w:rPr>
+    </w:lvl>
+    <w:lvl w:ilvl="6" w:tplc="580A0001" w:tentative="1">
+      <w:start w:val="1"/>
+      <w:numFmt w:val="bullet"/>
+      <w:lvlText w:val=""/>
+      <w:lvlJc w:val="left"/>
+      <w:pPr>
+        <w:ind w:left="5040" w:hanging="360"/>
+      </w:pPr>
+      <w:rPr>
+        <w:rFonts w:ascii="Symbol" w:hAnsi="Symbol" w:hint="default"/>
+      </w:rPr>
+    </w:lvl>
+    <w:lvl w:ilvl="7" w:tplc="580A0003" w:tentative="1">
+      <w:start w:val="1"/>
+      <w:numFmt w:val="bullet"/>
+      <w:lvlText w:val="o"/>
+      <w:lvlJc w:val="left"/>
+      <w:pPr>
+        <w:ind w:left="5760" w:hanging="360"/>
+      </w:pPr>
+      <w:rPr>
+        <w:rFonts w:ascii="Courier New" w:hAnsi="Courier New" w:cs="Courier New" w:hint="default"/>
+      </w:rPr>
+    </w:lvl>
+    <w:lvl w:ilvl="8" w:tplc="580A0005" w:tentative="1">
+      <w:start w:val="1"/>
+      <w:numFmt w:val="bullet"/>
+      <w:lvlText w:val=""/>
+      <w:lvlJc w:val="left"/>
+      <w:pPr>
+        <w:ind w:left="6480" w:hanging="360"/>
+      </w:pPr>
+      <w:rPr>
+        <w:rFonts w:ascii="Wingdings" w:hAnsi="Wingdings" w:hint="default"/>
+      </w:rPr>
+    </w:lvl>
+  </w:abstractNum>
+  <w:abstractNum w:abstractNumId="16" w15:restartNumberingAfterBreak="0">
     <w:nsid w:val="75046CB1"/>
     <w:multiLevelType w:val="hybridMultilevel"/>
     <w:tmpl w:val="CCAC5680"/>
@@ -1915,7 +3498,7 @@
       </w:rPr>
     </w:lvl>
   </w:abstractNum>
-  <w:abstractNum w:abstractNumId="10" w15:restartNumberingAfterBreak="0">
+  <w:abstractNum w:abstractNumId="17" w15:restartNumberingAfterBreak="0">
     <w:nsid w:val="75342600"/>
     <w:multiLevelType w:val="multilevel"/>
     <w:tmpl w:val="300A5FDA"/>
@@ -2065,37 +3648,58 @@
     </w:lvl>
   </w:abstractNum>
   <w:num w:numId="1" w16cid:durableId="570040897">
-    <w:abstractNumId w:val="4"/>
+    <w:abstractNumId w:val="6"/>
   </w:num>
   <w:num w:numId="2" w16cid:durableId="406879977">
-    <w:abstractNumId w:val="6"/>
+    <w:abstractNumId w:val="9"/>
   </w:num>
   <w:num w:numId="3" w16cid:durableId="1123040826">
-    <w:abstractNumId w:val="10"/>
+    <w:abstractNumId w:val="17"/>
   </w:num>
   <w:num w:numId="4" w16cid:durableId="1970893552">
     <w:abstractNumId w:val="0"/>
   </w:num>
   <w:num w:numId="5" w16cid:durableId="426272380">
+    <w:abstractNumId w:val="8"/>
+  </w:num>
+  <w:num w:numId="6" w16cid:durableId="1780369876">
+    <w:abstractNumId w:val="13"/>
+  </w:num>
+  <w:num w:numId="7" w16cid:durableId="767385269">
+    <w:abstractNumId w:val="4"/>
+  </w:num>
+  <w:num w:numId="8" w16cid:durableId="1354844181">
+    <w:abstractNumId w:val="2"/>
+  </w:num>
+  <w:num w:numId="9" w16cid:durableId="1776975121">
+    <w:abstractNumId w:val="11"/>
+  </w:num>
+  <w:num w:numId="10" w16cid:durableId="1466040327">
+    <w:abstractNumId w:val="16"/>
+  </w:num>
+  <w:num w:numId="11" w16cid:durableId="2003310048">
     <w:abstractNumId w:val="5"/>
   </w:num>
-  <w:num w:numId="6" w16cid:durableId="1780369876">
-    <w:abstractNumId w:val="8"/>
+  <w:num w:numId="12" w16cid:durableId="796683501">
+    <w:abstractNumId w:val="7"/>
   </w:num>
-  <w:num w:numId="7" w16cid:durableId="767385269">
-    <w:abstractNumId w:val="2"/>
+  <w:num w:numId="13" w16cid:durableId="2044623311">
+    <w:abstractNumId w:val="15"/>
   </w:num>
-  <w:num w:numId="8" w16cid:durableId="1354844181">
+  <w:num w:numId="14" w16cid:durableId="411246679">
+    <w:abstractNumId w:val="14"/>
+  </w:num>
+  <w:num w:numId="15" w16cid:durableId="174466947">
+    <w:abstractNumId w:val="3"/>
+  </w:num>
+  <w:num w:numId="16" w16cid:durableId="879896206">
+    <w:abstractNumId w:val="12"/>
+  </w:num>
+  <w:num w:numId="17" w16cid:durableId="1279068163">
     <w:abstractNumId w:val="1"/>
   </w:num>
-  <w:num w:numId="9" w16cid:durableId="1776975121">
-    <w:abstractNumId w:val="7"/>
-  </w:num>
-  <w:num w:numId="10" w16cid:durableId="1466040327">
-    <w:abstractNumId w:val="9"/>
-  </w:num>
-  <w:num w:numId="11" w16cid:durableId="2003310048">
-    <w:abstractNumId w:val="3"/>
+  <w:num w:numId="18" w16cid:durableId="1512910022">
+    <w:abstractNumId w:val="10"/>
   </w:num>
 </w:numbering>
 </file>

</xml_diff>